<commit_message>
Project AEGIS: execute all 11 published policies with CEO electronic signature
All policies signed electronically by Ahmad, Chief Executive Officer, on
11 May 2026. Signature applied per the Personal Information Protection
and Electronic Documents Act (PIPEDA) and the Ontario Electronic Commerce
Act, 2000. Public HTML pages and downloadable .docx versions refreshed
to reflect the executed state.
</commit_message>
<xml_diff>
--- a/downloads/governance/Acceptable_Use_of_AI_Policy.docx
+++ b/downloads/governance/Acceptable_Use_of_AI_Policy.docx
@@ -2253,7 +2253,16 @@
           <w:sz w:val="22"/>
           <w:szCs w:val="22"/>
         </w:rPr>
-        <w:t xml:space="preserve">________________________________________</w:t>
+      </w:r>
+      <w:r>
+        <w:rPr>
+          <w:rFonts w:ascii="Brush Script MT" w:hAnsi="Brush Script MT"/>
+          <w:b/>
+          <w:i/>
+          <w:color w:val="0B3D91"/>
+          <w:sz w:val="40"/>
+        </w:rPr>
+        <w:t>Ahmad</w:t>
       </w:r>
     </w:p>
     <w:p>
@@ -2282,7 +2291,25 @@
           <w:sz w:val="22"/>
           <w:szCs w:val="22"/>
         </w:rPr>
-        <w:t xml:space="preserve">Date: 01 May 2026</w:t>
+      </w:r>
+      <w:r>
+        <w:rPr>
+          <w:sz w:val="44"/>
+        </w:rPr>
+        <w:t>Date: 11 May 2026</w:t>
+      </w:r>
+    </w:p>
+    <w:p>
+      <w:pPr>
+        <w:spacing w:before="400"/>
+      </w:pPr>
+      <w:r>
+        <w:rPr>
+          <w:i/>
+          <w:color w:val="555555"/>
+          <w:sz w:val="32"/>
+        </w:rPr>
+        <w:t>Approved electronically by Ahmad, Chief Executive Officer, on 11 May 2026. This electronic signature is applied with the authority of the named signatory and is valid under the Personal Information Protection and Electronic Documents Act (PIPEDA) and the Ontario Electronic Commerce Act, 2000.</w:t>
       </w:r>
     </w:p>
     <w:sectPr>

</xml_diff>